<commit_message>
Set each contribution to 33.3 percent and remove the total row
</commit_message>
<xml_diff>
--- a/report/Project_Report.docx
+++ b/report/Project_Report.docx
@@ -7545,7 +7545,7 @@
                 <w:i w:val="0"/>
                 <w:sz w:val="18"/>
               </w:rPr>
-              <w:t>33⅓% (approximately 33%)</w:t>
+              <w:t>33.3%</w:t>
             </w:r>
           </w:p>
         </w:tc>
@@ -7595,7 +7595,7 @@
                 <w:i w:val="0"/>
                 <w:sz w:val="18"/>
               </w:rPr>
-              <w:t>33⅓% (approximately 33%)</w:t>
+              <w:t>33.3%</w:t>
             </w:r>
           </w:p>
         </w:tc>
@@ -7645,48 +7645,7 @@
                 <w:i w:val="0"/>
                 <w:sz w:val="18"/>
               </w:rPr>
-              <w:t>33⅓% (approximately 33%)</w:t>
-            </w:r>
-          </w:p>
-        </w:tc>
-      </w:tr>
-      <w:tr>
-        <w:trPr>
-          <w:cantSplit/>
-        </w:trPr>
-        <w:tc>
-          <w:tcPr>
-            <w:tcW w:type="dxa" w:w="3250"/>
-          </w:tcPr>
-          <w:p>
-            <w:r>
-              <w:rPr>
-                <w:b w:val="0"/>
-                <w:i w:val="0"/>
-                <w:sz w:val="18"/>
-              </w:rPr>
-              <w:t>Total</w:t>
-            </w:r>
-          </w:p>
-        </w:tc>
-        <w:tc>
-          <w:tcPr>
-            <w:tcW w:type="dxa" w:w="3250"/>
-          </w:tcPr>
-          <w:p/>
-        </w:tc>
-        <w:tc>
-          <w:tcPr>
-            <w:tcW w:type="dxa" w:w="3250"/>
-          </w:tcPr>
-          <w:p>
-            <w:r>
-              <w:rPr>
-                <w:b w:val="0"/>
-                <w:i w:val="0"/>
-                <w:sz w:val="18"/>
-              </w:rPr>
-              <w:t>100%</w:t>
+              <w:t>33.3%</w:t>
             </w:r>
           </w:p>
         </w:tc>
@@ -7696,15 +7655,6 @@
       <w:pPr>
         <w:spacing w:after="0"/>
       </w:pPr>
-    </w:p>
-    <w:p>
-      <w:r>
-        <w:rPr>
-          <w:b w:val="0"/>
-          <w:i w:val="0"/>
-        </w:rPr>
-        <w:t>Contributions are equal: one third per member (approximately 33%), totalling 100%.</w:t>
-      </w:r>
     </w:p>
     <w:p>
       <w:r>

</xml_diff>

<commit_message>
Restore the multi-UAV report title and remove footer labels
</commit_message>
<xml_diff>
--- a/report/Project_Report.docx
+++ b/report/Project_Report.docx
@@ -45,7 +45,7 @@
           <w:b w:val="0"/>
           <w:i w:val="0"/>
         </w:rPr>
-        <w:t xml:space="preserve"> Wind-Aware Multi-Drone Landing: Comparing MAPPO and PPO (IPPO)</w:t>
+        <w:t xml:space="preserve"> Robust Autonomous Multi-UAV Landing under Wind Disturbances Using PPO</w:t>
       </w:r>
     </w:p>
     <w:p>
@@ -7715,6 +7715,8 @@
     </w:p>
     <w:sectPr>
       <w:footerReference w:type="default" r:id="rId9"/>
+      <w:footerReference w:type="first" r:id="rId33"/>
+      <w:footerReference w:type="even" r:id="rId34"/>
       <w:pgSz w:w="11909" w:h="16834"/>
       <w:pgMar w:top="1138" w:right="1080" w:bottom="1080" w:left="1080" w:header="720" w:footer="720" w:gutter="0"/>
       <w:cols w:space="720"/>
@@ -7735,9 +7737,28 @@
       <w:rPr>
         <w:sz w:val="16"/>
       </w:rPr>
-      <w:t xml:space="preserve">43008 · Part E  |  </w:t>
     </w:r>
     <w:fldSimple w:instr="PAGE"/>
+  </w:p>
+</w:ftr>
+</file>
+
+<file path=word/footer2.xml><?xml version="1.0" encoding="utf-8"?>
+<w:ftr xmlns:m="http://schemas.openxmlformats.org/officeDocument/2006/math" xmlns:mc="http://schemas.openxmlformats.org/markup-compatibility/2006" xmlns:mo="http://schemas.microsoft.com/office/mac/office/2008/main" xmlns:mv="urn:schemas-microsoft-com:mac:vml" xmlns:o="urn:schemas-microsoft-com:office:office" xmlns:r="http://schemas.openxmlformats.org/officeDocument/2006/relationships" xmlns:v="urn:schemas-microsoft-com:vml" xmlns:w10="urn:schemas-microsoft-com:office:word" xmlns:w14="http://schemas.microsoft.com/office/word/2010/wordml" xmlns:w="http://schemas.openxmlformats.org/wordprocessingml/2006/main" xmlns:wne="http://schemas.microsoft.com/office/word/2006/wordml" xmlns:wp14="http://schemas.microsoft.com/office/word/2010/wordprocessingDrawing" xmlns:wp="http://schemas.openxmlformats.org/drawingml/2006/wordprocessingDrawing" xmlns:wpc="http://schemas.microsoft.com/office/word/2010/wordprocessingCanvas" xmlns:wpg="http://schemas.microsoft.com/office/word/2010/wordprocessingGroup" xmlns:wpi="http://schemas.microsoft.com/office/word/2010/wordprocessingInk" xmlns:wps="http://schemas.microsoft.com/office/word/2010/wordprocessingShape" mc:Ignorable="w14 wp14">
+  <w:p>
+    <w:pPr>
+      <w:pStyle w:val="Footer"/>
+    </w:pPr>
+  </w:p>
+</w:ftr>
+</file>
+
+<file path=word/footer3.xml><?xml version="1.0" encoding="utf-8"?>
+<w:ftr xmlns:m="http://schemas.openxmlformats.org/officeDocument/2006/math" xmlns:mc="http://schemas.openxmlformats.org/markup-compatibility/2006" xmlns:mo="http://schemas.microsoft.com/office/mac/office/2008/main" xmlns:mv="urn:schemas-microsoft-com:mac:vml" xmlns:o="urn:schemas-microsoft-com:office:office" xmlns:r="http://schemas.openxmlformats.org/officeDocument/2006/relationships" xmlns:v="urn:schemas-microsoft-com:vml" xmlns:w10="urn:schemas-microsoft-com:office:word" xmlns:w14="http://schemas.microsoft.com/office/word/2010/wordml" xmlns:w="http://schemas.openxmlformats.org/wordprocessingml/2006/main" xmlns:wne="http://schemas.microsoft.com/office/word/2006/wordml" xmlns:wp14="http://schemas.microsoft.com/office/word/2010/wordprocessingDrawing" xmlns:wp="http://schemas.openxmlformats.org/drawingml/2006/wordprocessingDrawing" xmlns:wpc="http://schemas.microsoft.com/office/word/2010/wordprocessingCanvas" xmlns:wpg="http://schemas.microsoft.com/office/word/2010/wordprocessingGroup" xmlns:wpi="http://schemas.microsoft.com/office/word/2010/wordprocessingInk" xmlns:wps="http://schemas.microsoft.com/office/word/2010/wordprocessingShape" mc:Ignorable="w14 wp14">
+  <w:p>
+    <w:pPr>
+      <w:pStyle w:val="Footer"/>
+    </w:pPr>
   </w:p>
 </w:ftr>
 </file>

</xml_diff>

<commit_message>
Simplify architecture diagrams and rebuild the validated report
</commit_message>
<xml_diff>
--- a/report/Project_Report.docx
+++ b/report/Project_Report.docx
@@ -1509,7 +1509,7 @@
       <w:r>
         <w:drawing>
           <wp:inline xmlns:a="http://schemas.openxmlformats.org/drawingml/2006/main" xmlns:pic="http://schemas.openxmlformats.org/drawingml/2006/picture">
-            <wp:extent cx="6080760" cy="3715447"/>
+            <wp:extent cx="6080760" cy="3083515"/>
             <wp:docPr id="5" name="Picture 5"/>
             <wp:cNvGraphicFramePr>
               <a:graphicFrameLocks noChangeAspect="1"/>
@@ -1530,7 +1530,7 @@
                   <pic:spPr>
                     <a:xfrm>
                       <a:off x="0" y="0"/>
-                      <a:ext cx="6080760" cy="3715447"/>
+                      <a:ext cx="6080760" cy="3083515"/>
                     </a:xfrm>
                     <a:prstGeom prst="rect"/>
                   </pic:spPr>
@@ -2142,7 +2142,7 @@
       <w:r>
         <w:drawing>
           <wp:inline xmlns:a="http://schemas.openxmlformats.org/drawingml/2006/main" xmlns:pic="http://schemas.openxmlformats.org/drawingml/2006/picture">
-            <wp:extent cx="6080760" cy="2517558"/>
+            <wp:extent cx="6080760" cy="2191578"/>
             <wp:docPr id="6" name="Picture 6"/>
             <wp:cNvGraphicFramePr>
               <a:graphicFrameLocks noChangeAspect="1"/>
@@ -2163,7 +2163,7 @@
                   <pic:spPr>
                     <a:xfrm>
                       <a:off x="0" y="0"/>
-                      <a:ext cx="6080760" cy="2517558"/>
+                      <a:ext cx="6080760" cy="2191578"/>
                     </a:xfrm>
                     <a:prstGeom prst="rect"/>
                   </pic:spPr>
@@ -7715,8 +7715,6 @@
     </w:p>
     <w:sectPr>
       <w:footerReference w:type="default" r:id="rId9"/>
-      <w:footerReference w:type="first" r:id="rId33"/>
-      <w:footerReference w:type="even" r:id="rId34"/>
       <w:pgSz w:w="11909" w:h="16834"/>
       <w:pgMar w:top="1138" w:right="1080" w:bottom="1080" w:left="1080" w:header="720" w:footer="720" w:gutter="0"/>
       <w:cols w:space="720"/>
@@ -7739,26 +7737,6 @@
       </w:rPr>
     </w:r>
     <w:fldSimple w:instr="PAGE"/>
-  </w:p>
-</w:ftr>
-</file>
-
-<file path=word/footer2.xml><?xml version="1.0" encoding="utf-8"?>
-<w:ftr xmlns:m="http://schemas.openxmlformats.org/officeDocument/2006/math" xmlns:mc="http://schemas.openxmlformats.org/markup-compatibility/2006" xmlns:mo="http://schemas.microsoft.com/office/mac/office/2008/main" xmlns:mv="urn:schemas-microsoft-com:mac:vml" xmlns:o="urn:schemas-microsoft-com:office:office" xmlns:r="http://schemas.openxmlformats.org/officeDocument/2006/relationships" xmlns:v="urn:schemas-microsoft-com:vml" xmlns:w10="urn:schemas-microsoft-com:office:word" xmlns:w14="http://schemas.microsoft.com/office/word/2010/wordml" xmlns:w="http://schemas.openxmlformats.org/wordprocessingml/2006/main" xmlns:wne="http://schemas.microsoft.com/office/word/2006/wordml" xmlns:wp14="http://schemas.microsoft.com/office/word/2010/wordprocessingDrawing" xmlns:wp="http://schemas.openxmlformats.org/drawingml/2006/wordprocessingDrawing" xmlns:wpc="http://schemas.microsoft.com/office/word/2010/wordprocessingCanvas" xmlns:wpg="http://schemas.microsoft.com/office/word/2010/wordprocessingGroup" xmlns:wpi="http://schemas.microsoft.com/office/word/2010/wordprocessingInk" xmlns:wps="http://schemas.microsoft.com/office/word/2010/wordprocessingShape" mc:Ignorable="w14 wp14">
-  <w:p>
-    <w:pPr>
-      <w:pStyle w:val="Footer"/>
-    </w:pPr>
-  </w:p>
-</w:ftr>
-</file>
-
-<file path=word/footer3.xml><?xml version="1.0" encoding="utf-8"?>
-<w:ftr xmlns:m="http://schemas.openxmlformats.org/officeDocument/2006/math" xmlns:mc="http://schemas.openxmlformats.org/markup-compatibility/2006" xmlns:mo="http://schemas.microsoft.com/office/mac/office/2008/main" xmlns:mv="urn:schemas-microsoft-com:mac:vml" xmlns:o="urn:schemas-microsoft-com:office:office" xmlns:r="http://schemas.openxmlformats.org/officeDocument/2006/relationships" xmlns:v="urn:schemas-microsoft-com:vml" xmlns:w10="urn:schemas-microsoft-com:office:word" xmlns:w14="http://schemas.microsoft.com/office/word/2010/wordml" xmlns:w="http://schemas.openxmlformats.org/wordprocessingml/2006/main" xmlns:wne="http://schemas.microsoft.com/office/word/2006/wordml" xmlns:wp14="http://schemas.microsoft.com/office/word/2010/wordprocessingDrawing" xmlns:wp="http://schemas.openxmlformats.org/drawingml/2006/wordprocessingDrawing" xmlns:wpc="http://schemas.microsoft.com/office/word/2010/wordprocessingCanvas" xmlns:wpg="http://schemas.microsoft.com/office/word/2010/wordprocessingGroup" xmlns:wpi="http://schemas.microsoft.com/office/word/2010/wordprocessingInk" xmlns:wps="http://schemas.microsoft.com/office/word/2010/wordprocessingShape" mc:Ignorable="w14 wp14">
-  <w:p>
-    <w:pPr>
-      <w:pStyle w:val="Footer"/>
-    </w:pPr>
   </w:p>
 </w:ftr>
 </file>

</xml_diff>

<commit_message>
Link the implementation repository from the report abstract
</commit_message>
<xml_diff>
--- a/report/Project_Report.docx
+++ b/report/Project_Report.docx
@@ -378,7 +378,25 @@
           <w:b w:val="0"/>
           <w:i w:val="0"/>
         </w:rPr>
-        <w:t>This project compares MAPPO and parameter-sharing PPO (IPPO) for four-drone landing under wind, observation noise and command delay. A custom environment models Tello and Matrice 30 (M30), while a browser GUI supports telemetry and Tello visualisation in Gazebo. Both algorithms produce continuous three-axis velocity commands. Each condition is evaluated over the same 100 episode seeds. After 1.5 million calm-weather steps, four-drone success was 100%/99% for Tello and 98%/98% for M30 (MAPPO/PPO). After 5 million wind-training steps, success was 90%/91% for Tello at 3 m/s and 45%/41% for M30 at 10 m/s. No collisions occurred in these evaluations. Wind-resistant landing precision remains the main challenge.</w:t>
+        <w:t xml:space="preserve">This project compares MAPPO and parameter-sharing PPO (IPPO) for four-drone landing under wind, observation noise and command delay. A custom environment models Tello and Matrice 30 (M30), while a browser GUI supports telemetry and Tello visualisation in Gazebo. Both algorithms produce continuous three-axis velocity commands. Each condition is evaluated over the same 100 episode seeds. After 1.5 million calm-weather steps, four-drone success was 100%/99% for Tello and 98%/98% for M30 (MAPPO/PPO). After 5 million wind-training steps, success was 90%/91% for Tello at 3 m/s and 45%/41% for M30 at 10 m/s. No collisions occurred in these evaluations. Wind-resistant landing precision remains the main challenge. The implementation is available at </w:t>
+      </w:r>
+      <w:hyperlink r:id="rId10">
+        <w:r>
+          <w:rPr>
+            <w:b w:val="0"/>
+            <w:i w:val="0"/>
+            <w:color w:val="175D7B"/>
+            <w:u w:val="single"/>
+          </w:rPr>
+          <w:t>https://github.com/haohao9555/tello-multi-landing</w:t>
+        </w:r>
+      </w:hyperlink>
+      <w:r>
+        <w:rPr>
+          <w:b w:val="0"/>
+          <w:i w:val="0"/>
+        </w:rPr>
+        <w:t>.</w:t>
       </w:r>
     </w:p>
     <w:p>
@@ -647,7 +665,7 @@
                     <pic:cNvPicPr/>
                   </pic:nvPicPr>
                   <pic:blipFill>
-                    <a:blip r:embed="rId10"/>
+                    <a:blip r:embed="rId11"/>
                     <a:stretch>
                       <a:fillRect/>
                     </a:stretch>
@@ -720,7 +738,7 @@
                     <pic:cNvPicPr/>
                   </pic:nvPicPr>
                   <pic:blipFill>
-                    <a:blip r:embed="rId11"/>
+                    <a:blip r:embed="rId12"/>
                     <a:stretch>
                       <a:fillRect/>
                     </a:stretch>
@@ -1323,7 +1341,7 @@
                     <pic:cNvPicPr/>
                   </pic:nvPicPr>
                   <pic:blipFill>
-                    <a:blip r:embed="rId12"/>
+                    <a:blip r:embed="rId13"/>
                     <a:stretch>
                       <a:fillRect/>
                     </a:stretch>
@@ -1417,7 +1435,7 @@
                     <pic:cNvPicPr/>
                   </pic:nvPicPr>
                   <pic:blipFill>
-                    <a:blip r:embed="rId13"/>
+                    <a:blip r:embed="rId14"/>
                     <a:stretch>
                       <a:fillRect/>
                     </a:stretch>
@@ -1522,7 +1540,7 @@
                     <pic:cNvPicPr/>
                   </pic:nvPicPr>
                   <pic:blipFill>
-                    <a:blip r:embed="rId14"/>
+                    <a:blip r:embed="rId15"/>
                     <a:stretch>
                       <a:fillRect/>
                     </a:stretch>
@@ -2155,7 +2173,7 @@
                     <pic:cNvPicPr/>
                   </pic:nvPicPr>
                   <pic:blipFill>
-                    <a:blip r:embed="rId15"/>
+                    <a:blip r:embed="rId16"/>
                     <a:stretch>
                       <a:fillRect/>
                     </a:stretch>
@@ -2845,7 +2863,7 @@
                     <pic:cNvPicPr/>
                   </pic:nvPicPr>
                   <pic:blipFill>
-                    <a:blip r:embed="rId16"/>
+                    <a:blip r:embed="rId17"/>
                     <a:stretch>
                       <a:fillRect/>
                     </a:stretch>
@@ -2948,7 +2966,7 @@
                     <pic:cNvPicPr/>
                   </pic:nvPicPr>
                   <pic:blipFill>
-                    <a:blip r:embed="rId17"/>
+                    <a:blip r:embed="rId18"/>
                     <a:stretch>
                       <a:fillRect/>
                     </a:stretch>
@@ -3472,7 +3490,7 @@
                     <pic:cNvPicPr/>
                   </pic:nvPicPr>
                   <pic:blipFill>
-                    <a:blip r:embed="rId18"/>
+                    <a:blip r:embed="rId19"/>
                     <a:stretch>
                       <a:fillRect/>
                     </a:stretch>
@@ -4922,7 +4940,7 @@
                     <pic:cNvPicPr/>
                   </pic:nvPicPr>
                   <pic:blipFill>
-                    <a:blip r:embed="rId19"/>
+                    <a:blip r:embed="rId20"/>
                     <a:stretch>
                       <a:fillRect/>
                     </a:stretch>
@@ -5013,7 +5031,7 @@
                     <pic:cNvPicPr/>
                   </pic:nvPicPr>
                   <pic:blipFill>
-                    <a:blip r:embed="rId20"/>
+                    <a:blip r:embed="rId21"/>
                     <a:stretch>
                       <a:fillRect/>
                     </a:stretch>
@@ -6247,7 +6265,7 @@
                     <pic:cNvPicPr/>
                   </pic:nvPicPr>
                   <pic:blipFill>
-                    <a:blip r:embed="rId21"/>
+                    <a:blip r:embed="rId22"/>
                     <a:stretch>
                       <a:fillRect/>
                     </a:stretch>
@@ -6308,7 +6326,7 @@
                     <pic:cNvPicPr/>
                   </pic:nvPicPr>
                   <pic:blipFill>
-                    <a:blip r:embed="rId22"/>
+                    <a:blip r:embed="rId23"/>
                     <a:stretch>
                       <a:fillRect/>
                     </a:stretch>
@@ -6381,7 +6399,7 @@
                     <pic:cNvPicPr/>
                   </pic:nvPicPr>
                   <pic:blipFill>
-                    <a:blip r:embed="rId23"/>
+                    <a:blip r:embed="rId24"/>
                     <a:stretch>
                       <a:fillRect/>
                     </a:stretch>
@@ -6442,7 +6460,7 @@
                     <pic:cNvPicPr/>
                   </pic:nvPicPr>
                   <pic:blipFill>
-                    <a:blip r:embed="rId24"/>
+                    <a:blip r:embed="rId25"/>
                     <a:stretch>
                       <a:fillRect/>
                     </a:stretch>
@@ -6503,7 +6521,7 @@
                     <pic:cNvPicPr/>
                   </pic:nvPicPr>
                   <pic:blipFill>
-                    <a:blip r:embed="rId25"/>
+                    <a:blip r:embed="rId26"/>
                     <a:stretch>
                       <a:fillRect/>
                     </a:stretch>
@@ -6585,7 +6603,7 @@
                     <pic:cNvPicPr/>
                   </pic:nvPicPr>
                   <pic:blipFill>
-                    <a:blip r:embed="rId26"/>
+                    <a:blip r:embed="rId27"/>
                     <a:stretch>
                       <a:fillRect/>
                     </a:stretch>
@@ -6637,7 +6655,7 @@
                     <pic:cNvPicPr/>
                   </pic:nvPicPr>
                   <pic:blipFill>
-                    <a:blip r:embed="rId27"/>
+                    <a:blip r:embed="rId28"/>
                     <a:stretch>
                       <a:fillRect/>
                     </a:stretch>
@@ -6741,7 +6759,7 @@
                     <pic:cNvPicPr/>
                   </pic:nvPicPr>
                   <pic:blipFill>
-                    <a:blip r:embed="rId28"/>
+                    <a:blip r:embed="rId29"/>
                     <a:stretch>
                       <a:fillRect/>
                     </a:stretch>
@@ -6815,7 +6833,7 @@
                     <pic:cNvPicPr/>
                   </pic:nvPicPr>
                   <pic:blipFill>
-                    <a:blip r:embed="rId29"/>
+                    <a:blip r:embed="rId30"/>
                     <a:stretch>
                       <a:fillRect/>
                     </a:stretch>
@@ -6889,7 +6907,7 @@
                     <pic:cNvPicPr/>
                   </pic:nvPicPr>
                   <pic:blipFill>
-                    <a:blip r:embed="rId30"/>
+                    <a:blip r:embed="rId31"/>
                     <a:stretch>
                       <a:fillRect/>
                     </a:stretch>
@@ -6963,7 +6981,7 @@
                     <pic:cNvPicPr/>
                   </pic:nvPicPr>
                   <pic:blipFill>
-                    <a:blip r:embed="rId31"/>
+                    <a:blip r:embed="rId32"/>
                     <a:stretch>
                       <a:fillRect/>
                     </a:stretch>
@@ -7037,7 +7055,7 @@
                     <pic:cNvPicPr/>
                   </pic:nvPicPr>
                   <pic:blipFill>
-                    <a:blip r:embed="rId32"/>
+                    <a:blip r:embed="rId33"/>
                     <a:stretch>
                       <a:fillRect/>
                     </a:stretch>

</xml_diff>